<commit_message>
Added context to documentation
</commit_message>
<xml_diff>
--- a/Architektur_Implementierungsdetails.docx
+++ b/Architektur_Implementierungsdetails.docx
@@ -2910,7 +2910,33 @@
           <w:sz w:val="22"/>
           <w:szCs w:val="22"/>
         </w:rPr>
-        <w:t xml:space="preserve">, wodurch pro Client ein separater kryptographischer Kontext etabliert wird. Die anschließende Datenübertragung erfolgt über </w:t>
+        <w:t>, wodurch pro Client ein separater kryptographischer Kontext etabliert wird. Die anschließende Datenübertragung erfolgt über</w:t>
+      </w:r>
+      <w:r>
+        <w:rPr>
+          <w:rFonts w:ascii="Helvetica" w:hAnsi="Helvetica"/>
+          <w:sz w:val="22"/>
+          <w:szCs w:val="22"/>
+        </w:rPr>
+        <w:t xml:space="preserve"> 256 </w:t>
+      </w:r>
+      <w:proofErr w:type="spellStart"/>
+      <w:r>
+        <w:rPr>
+          <w:rFonts w:ascii="Helvetica" w:hAnsi="Helvetica"/>
+          <w:sz w:val="22"/>
+          <w:szCs w:val="22"/>
+        </w:rPr>
+        <w:t>bit</w:t>
+      </w:r>
+      <w:proofErr w:type="spellEnd"/>
+      <w:r>
+        <w:rPr>
+          <w:rFonts w:ascii="Helvetica" w:hAnsi="Helvetica"/>
+          <w:sz w:val="22"/>
+          <w:szCs w:val="22"/>
+        </w:rPr>
+        <w:t xml:space="preserve"> </w:t>
       </w:r>
       <w:r>
         <w:rPr>
@@ -2921,16 +2947,35 @@
           <w:sz w:val="22"/>
           <w:szCs w:val="22"/>
         </w:rPr>
-        <w:t>AEAD-Verschlüsselung (256 Bit</w:t>
+        <w:t>AEAD-Verschlüsselung</w:t>
       </w:r>
       <w:r>
         <w:rPr>
           <w:rStyle w:val="Fett"/>
           <w:rFonts w:ascii="Helvetica" w:eastAsiaTheme="majorEastAsia" w:hAnsi="Helvetica"/>
-          <w:sz w:val="22"/>
-          <w:szCs w:val="22"/>
-        </w:rPr>
-        <w:t>)</w:t>
+          <w:b w:val="0"/>
+          <w:bCs w:val="0"/>
+          <w:sz w:val="22"/>
+          <w:szCs w:val="22"/>
+        </w:rPr>
+        <w:t xml:space="preserve"> mittels</w:t>
+      </w:r>
+      <w:r>
+        <w:rPr>
+          <w:rStyle w:val="Fett"/>
+          <w:rFonts w:ascii="Helvetica" w:eastAsiaTheme="majorEastAsia" w:hAnsi="Helvetica"/>
+          <w:sz w:val="22"/>
+          <w:szCs w:val="22"/>
+        </w:rPr>
+        <w:t xml:space="preserve"> </w:t>
+      </w:r>
+      <w:r>
+        <w:rPr>
+          <w:rFonts w:ascii="Helvetica" w:hAnsi="Helvetica"/>
+          <w:sz w:val="22"/>
+          <w:szCs w:val="22"/>
+        </w:rPr>
+        <w:t>XSalsa20-Poly1305</w:t>
       </w:r>
       <w:r>
         <w:rPr>
@@ -3266,55 +3311,74 @@
           <w:sz w:val="22"/>
           <w:szCs w:val="22"/>
         </w:rPr>
-        <w:t xml:space="preserve"> (--</w:t>
-      </w:r>
-      <w:proofErr w:type="spellStart"/>
+        <w:t xml:space="preserve"> </w:t>
+      </w:r>
       <w:r>
         <w:rPr>
           <w:rStyle w:val="Fett"/>
           <w:rFonts w:ascii="Helvetica" w:eastAsiaTheme="majorEastAsia" w:hAnsi="Helvetica"/>
           <w:b w:val="0"/>
           <w:bCs w:val="0"/>
-          <w:sz w:val="22"/>
-          <w:szCs w:val="22"/>
-        </w:rPr>
-        <w:t>no</w:t>
-      </w:r>
-      <w:proofErr w:type="spellEnd"/>
+          <w:i/>
+          <w:iCs/>
+          <w:sz w:val="22"/>
+          <w:szCs w:val="22"/>
+        </w:rPr>
+        <w:t>--</w:t>
+      </w:r>
+      <w:proofErr w:type="spellStart"/>
       <w:r>
         <w:rPr>
           <w:rStyle w:val="Fett"/>
           <w:rFonts w:ascii="Helvetica" w:eastAsiaTheme="majorEastAsia" w:hAnsi="Helvetica"/>
           <w:b w:val="0"/>
           <w:bCs w:val="0"/>
-          <w:sz w:val="22"/>
-          <w:szCs w:val="22"/>
-        </w:rPr>
-        <w:t>-server-</w:t>
-      </w:r>
-      <w:proofErr w:type="spellStart"/>
+          <w:i/>
+          <w:iCs/>
+          <w:sz w:val="22"/>
+          <w:szCs w:val="22"/>
+        </w:rPr>
+        <w:t>no</w:t>
+      </w:r>
+      <w:proofErr w:type="spellEnd"/>
       <w:r>
         <w:rPr>
           <w:rStyle w:val="Fett"/>
           <w:rFonts w:ascii="Helvetica" w:eastAsiaTheme="majorEastAsia" w:hAnsi="Helvetica"/>
           <w:b w:val="0"/>
           <w:bCs w:val="0"/>
-          <w:sz w:val="22"/>
-          <w:szCs w:val="22"/>
-        </w:rPr>
-        <w:t>auth</w:t>
-      </w:r>
-      <w:proofErr w:type="spellEnd"/>
+          <w:i/>
+          <w:iCs/>
+          <w:sz w:val="22"/>
+          <w:szCs w:val="22"/>
+        </w:rPr>
+        <w:t>-server-</w:t>
+      </w:r>
+      <w:proofErr w:type="spellStart"/>
       <w:r>
         <w:rPr>
           <w:rStyle w:val="Fett"/>
           <w:rFonts w:ascii="Helvetica" w:eastAsiaTheme="majorEastAsia" w:hAnsi="Helvetica"/>
           <w:b w:val="0"/>
           <w:bCs w:val="0"/>
-          <w:sz w:val="22"/>
-          <w:szCs w:val="22"/>
-        </w:rPr>
-        <w:t xml:space="preserve">) deaktivieren. </w:t>
+          <w:i/>
+          <w:iCs/>
+          <w:sz w:val="22"/>
+          <w:szCs w:val="22"/>
+        </w:rPr>
+        <w:t>auth</w:t>
+      </w:r>
+      <w:proofErr w:type="spellEnd"/>
+      <w:r>
+        <w:rPr>
+          <w:rStyle w:val="Fett"/>
+          <w:rFonts w:ascii="Helvetica" w:eastAsiaTheme="majorEastAsia" w:hAnsi="Helvetica"/>
+          <w:b w:val="0"/>
+          <w:bCs w:val="0"/>
+          <w:sz w:val="22"/>
+          <w:szCs w:val="22"/>
+        </w:rPr>
+        <w:t xml:space="preserve"> deaktivieren. </w:t>
       </w:r>
     </w:p>
     <w:p>
@@ -3412,7 +3476,75 @@
           <w:sz w:val="22"/>
           <w:szCs w:val="22"/>
         </w:rPr>
-        <w:t>Obwohl der Transportkanal des Tunnels (MQTT über TCP) eine zuverlässige und geordnete Übertragung gewährleistet, wurde die MTU des verwendeten TUN-Interfaces bewusst auf einen festen Wert begrenzt. Hintergrund ist, dass der Tunnel auf Paketebene arbeitet und IP-Pakete aus dem TUN-Device direkt als Payload in MQTT-Nachrichten kapselt. In der Implementierung werden diese IP-Pakete mit einem festen Puffer (z. B. 1500 Byte) aus dem TUN-Device gelesen und anschließend unverändert weitergeleitet. Würde das Betriebssystem IP-Pakete erzeugen, die größer als der verfügbare Puffer oder die erwartete MTU sind, könnte dies zu einer unvollständigen Paketübernahme (Trunkierung) und damit zu korrupten IP-Paketen führen. Solche Fehler lassen sich nicht durch TCP korrigieren, da TCP erst oberhalb der IP-Schicht wirkt und bereits beschädigte IP-Pakete vom Netzwerkstack verworfen werden.</w:t>
+        <w:t>Obwohl der Transportkanal des Tunnels (MQTT über TCP) eine zuverlässige und geordnete Übertragung gewährleistet, wurde die MTU des verwendeten TUN-Interfaces bewusst auf einen festen Wert begrenzt. Hintergrund ist, dass der Tunnel auf Paketebene arbeitet und IP-Pakete aus dem TUN-Device direkt als Payload in MQTT-Nachrichten kapselt. In der Implementierung werden diese IP-Pakete mit einem festen Puffer (1500 Byte) aus dem TUN-Device gelesen und anschließend unverändert weitergeleitet. Würde das Betriebssystem IP-Pakete erzeugen, die größer als der verfügbare Puffer oder die erwartete MTU sind, könnte dies zu einer unvollständigen Paketübernahme</w:t>
+      </w:r>
+      <w:r>
+        <w:rPr>
+          <w:rFonts w:ascii="Helvetica" w:hAnsi="Helvetica"/>
+          <w:sz w:val="22"/>
+          <w:szCs w:val="22"/>
+        </w:rPr>
+        <w:t xml:space="preserve"> </w:t>
+      </w:r>
+      <w:r>
+        <w:rPr>
+          <w:rFonts w:ascii="Helvetica" w:hAnsi="Helvetica"/>
+          <w:sz w:val="22"/>
+          <w:szCs w:val="22"/>
+        </w:rPr>
+        <w:t>und damit zu korrupten IP-Paketen führen. Solche Fehler lassen sich nicht durch TCP korrigieren, da TCP erst oberhalb der IP-Schicht wirkt und bereits beschädigte IP-Pakete vom Netzwerkstack verworfen werden.</w:t>
+      </w:r>
+      <w:r>
+        <w:rPr>
+          <w:rFonts w:ascii="Helvetica" w:hAnsi="Helvetica"/>
+          <w:sz w:val="22"/>
+          <w:szCs w:val="22"/>
+        </w:rPr>
+        <w:t xml:space="preserve"> Um einen Puffer zur üblichen MTU in Ethernet-Netzwerken zu </w:t>
+      </w:r>
+      <w:proofErr w:type="gramStart"/>
+      <w:r>
+        <w:rPr>
+          <w:rFonts w:ascii="Helvetica" w:hAnsi="Helvetica"/>
+          <w:sz w:val="22"/>
+          <w:szCs w:val="22"/>
+        </w:rPr>
+        <w:t>haben</w:t>
+      </w:r>
+      <w:proofErr w:type="gramEnd"/>
+      <w:r>
+        <w:rPr>
+          <w:rFonts w:ascii="Helvetica" w:hAnsi="Helvetica"/>
+          <w:sz w:val="22"/>
+          <w:szCs w:val="22"/>
+        </w:rPr>
+        <w:t xml:space="preserve"> wird die MTU des TUN-Devices auf 1400 Bytes gesetzt um insbesondere bei der Nutzung der integrierten Verschlüsselung durch den Overhead keine Fragmentation zu erreichen die zwar bei getunneltem TCP-Traffic durch das Protokoll aufgefangen werden würde, bei UDP Traffic aber Datagramme unwiderruflich abschneiden würde. </w:t>
+      </w:r>
+      <w:r>
+        <w:rPr>
+          <w:rFonts w:ascii="Helvetica" w:hAnsi="Helvetica"/>
+          <w:sz w:val="22"/>
+          <w:szCs w:val="22"/>
+        </w:rPr>
+        <w:t xml:space="preserve">Der Overhead durch die Verschlüsslung beträgt durch 24 Bit </w:t>
+      </w:r>
+      <w:proofErr w:type="spellStart"/>
+      <w:r>
+        <w:rPr>
+          <w:rFonts w:ascii="Helvetica" w:hAnsi="Helvetica"/>
+          <w:sz w:val="22"/>
+          <w:szCs w:val="22"/>
+        </w:rPr>
+        <w:t>Nonce</w:t>
+      </w:r>
+      <w:proofErr w:type="spellEnd"/>
+      <w:r>
+        <w:rPr>
+          <w:rFonts w:ascii="Helvetica" w:hAnsi="Helvetica"/>
+          <w:sz w:val="22"/>
+          <w:szCs w:val="22"/>
+        </w:rPr>
+        <w:t xml:space="preserve"> und 16 Bit Message Authentication Code 40 Byte pro gekapseltes Paket.</w:t>
       </w:r>
     </w:p>
     <w:p>
@@ -3430,6 +3562,7 @@
           <w:sz w:val="22"/>
           <w:szCs w:val="22"/>
         </w:rPr>
+        <w:lastRenderedPageBreak/>
         <w:t>Durch die explizite MTU-Begrenzung wird sichergestellt, dass der Kernel ausschließlich IP-Pakete innerhalb der erwarteten Größenordnung über das TUN-Interface ausliefert. Dies erhöht die Robustheit der Implementierung</w:t>
       </w:r>
       <w:r>
@@ -3438,33 +3571,15 @@
           <w:sz w:val="22"/>
           <w:szCs w:val="22"/>
         </w:rPr>
-        <w:t xml:space="preserve"> </w:t>
-      </w:r>
-      <w:proofErr w:type="spellStart"/>
-      <w:r>
-        <w:rPr>
-          <w:rFonts w:ascii="Helvetica" w:hAnsi="Helvetica"/>
-          <w:sz w:val="22"/>
-          <w:szCs w:val="22"/>
-        </w:rPr>
-        <w:t xml:space="preserve">und </w:t>
-      </w:r>
-      <w:r>
-        <w:rPr>
-          <w:rFonts w:ascii="Helvetica" w:hAnsi="Helvetica"/>
-          <w:sz w:val="22"/>
-          <w:szCs w:val="22"/>
-        </w:rPr>
-        <w:t>reduziert</w:t>
-      </w:r>
-      <w:proofErr w:type="spellEnd"/>
-      <w:r>
-        <w:rPr>
-          <w:rFonts w:ascii="Helvetica" w:hAnsi="Helvetica"/>
-          <w:sz w:val="22"/>
-          <w:szCs w:val="22"/>
-        </w:rPr>
-        <w:t xml:space="preserve"> das Risiko von Fragmentierung</w:t>
+        <w:t xml:space="preserve"> und </w:t>
+      </w:r>
+      <w:r>
+        <w:rPr>
+          <w:rFonts w:ascii="Helvetica" w:hAnsi="Helvetica"/>
+          <w:sz w:val="22"/>
+          <w:szCs w:val="22"/>
+        </w:rPr>
+        <w:t>reduziert das Risiko von Fragmentierung</w:t>
       </w:r>
       <w:r>
         <w:rPr>
@@ -3588,7 +3703,6 @@
           <w:sz w:val="22"/>
           <w:szCs w:val="22"/>
         </w:rPr>
-        <w:lastRenderedPageBreak/>
         <w:t>Paketverluste deutlich reduziert</w:t>
       </w:r>
       <w:r>
@@ -5461,6 +5575,59 @@
           <w:szCs w:val="22"/>
         </w:rPr>
       </w:pPr>
+    </w:p>
+    <w:p>
+      <w:pPr>
+        <w:spacing w:before="100" w:beforeAutospacing="1" w:after="100" w:afterAutospacing="1"/>
+        <w:rPr>
+          <w:rFonts w:ascii="Helvetica" w:hAnsi="Helvetica"/>
+          <w:sz w:val="22"/>
+          <w:szCs w:val="22"/>
+        </w:rPr>
+      </w:pPr>
+      <w:r>
+        <w:rPr>
+          <w:rFonts w:ascii="Helvetica" w:hAnsi="Helvetica"/>
+          <w:sz w:val="22"/>
+          <w:szCs w:val="22"/>
+        </w:rPr>
+        <w:lastRenderedPageBreak/>
+        <w:drawing>
+          <wp:inline distT="0" distB="0" distL="0" distR="0" wp14:anchorId="380FECB5" wp14:editId="47FA630D">
+            <wp:extent cx="5760720" cy="3244215"/>
+            <wp:effectExtent l="0" t="0" r="5080" b="0"/>
+            <wp:docPr id="383987010" name="Grafik 1" descr="Ein Bild, das Text, Diagramm, Reihe, Plan enthält.&#10;&#10;Automatisch generierte Beschreibung"/>
+            <wp:cNvGraphicFramePr>
+              <a:graphicFrameLocks xmlns:a="http://schemas.openxmlformats.org/drawingml/2006/main" noChangeAspect="1"/>
+            </wp:cNvGraphicFramePr>
+            <a:graphic xmlns:a="http://schemas.openxmlformats.org/drawingml/2006/main">
+              <a:graphicData uri="http://schemas.openxmlformats.org/drawingml/2006/picture">
+                <pic:pic xmlns:pic="http://schemas.openxmlformats.org/drawingml/2006/picture">
+                  <pic:nvPicPr>
+                    <pic:cNvPr id="383987010" name="Grafik 1" descr="Ein Bild, das Text, Diagramm, Reihe, Plan enthält.&#10;&#10;Automatisch generierte Beschreibung"/>
+                    <pic:cNvPicPr/>
+                  </pic:nvPicPr>
+                  <pic:blipFill>
+                    <a:blip r:embed="rId8"/>
+                    <a:stretch>
+                      <a:fillRect/>
+                    </a:stretch>
+                  </pic:blipFill>
+                  <pic:spPr>
+                    <a:xfrm>
+                      <a:off x="0" y="0"/>
+                      <a:ext cx="5760720" cy="3244215"/>
+                    </a:xfrm>
+                    <a:prstGeom prst="rect">
+                      <a:avLst/>
+                    </a:prstGeom>
+                  </pic:spPr>
+                </pic:pic>
+              </a:graphicData>
+            </a:graphic>
+          </wp:inline>
+        </w:drawing>
+      </w:r>
     </w:p>
     <w:p>
       <w:pPr>

</xml_diff>

<commit_message>
Last commit on implementation documentation
</commit_message>
<xml_diff>
--- a/Architektur_Implementierungsdetails.docx
+++ b/Architektur_Implementierungsdetails.docx
@@ -4012,7 +4012,7 @@
                 <w:lang w:eastAsia="de-DE"/>
                 <w14:ligatures w14:val="none"/>
               </w:rPr>
-              <w:t>Betriebsmodus</w:t>
+              <w:t>Rolle / Mode</w:t>
             </w:r>
           </w:p>
         </w:tc>
@@ -4139,7 +4139,51 @@
                 <w:lang w:eastAsia="de-DE"/>
                 <w14:ligatures w14:val="none"/>
               </w:rPr>
-              <w:t>Legt den Betriebsmodus des Tunnels fest (</w:t>
+              <w:t>Legt den Betriebsmodus d</w:t>
+            </w:r>
+            <w:r>
+              <w:rPr>
+                <w:rFonts w:ascii="Helvetica" w:eastAsia="Times New Roman" w:hAnsi="Helvetica" w:cs="Times New Roman"/>
+                <w:kern w:val="0"/>
+                <w:sz w:val="22"/>
+                <w:szCs w:val="22"/>
+                <w:lang w:eastAsia="de-DE"/>
+                <w14:ligatures w14:val="none"/>
+              </w:rPr>
+              <w:t>er</w:t>
+            </w:r>
+            <w:r>
+              <w:rPr>
+                <w:rFonts w:ascii="Helvetica" w:eastAsia="Times New Roman" w:hAnsi="Helvetica" w:cs="Times New Roman"/>
+                <w:kern w:val="0"/>
+                <w:sz w:val="22"/>
+                <w:szCs w:val="22"/>
+                <w:lang w:eastAsia="de-DE"/>
+                <w14:ligatures w14:val="none"/>
+              </w:rPr>
+              <w:t xml:space="preserve"> Tunnel</w:t>
+            </w:r>
+            <w:r>
+              <w:rPr>
+                <w:rFonts w:ascii="Helvetica" w:eastAsia="Times New Roman" w:hAnsi="Helvetica" w:cs="Times New Roman"/>
+                <w:kern w:val="0"/>
+                <w:sz w:val="22"/>
+                <w:szCs w:val="22"/>
+                <w:lang w:eastAsia="de-DE"/>
+                <w14:ligatures w14:val="none"/>
+              </w:rPr>
+              <w:t>komponente</w:t>
+            </w:r>
+            <w:r>
+              <w:rPr>
+                <w:rFonts w:ascii="Helvetica" w:eastAsia="Times New Roman" w:hAnsi="Helvetica" w:cs="Times New Roman"/>
+                <w:kern w:val="0"/>
+                <w:sz w:val="22"/>
+                <w:szCs w:val="22"/>
+                <w:lang w:eastAsia="de-DE"/>
+                <w14:ligatures w14:val="none"/>
+              </w:rPr>
+              <w:t xml:space="preserve"> fest (</w:t>
             </w:r>
             <w:proofErr w:type="spellStart"/>
             <w:r>
@@ -5568,6 +5612,32 @@
     </w:tbl>
     <w:p>
       <w:pPr>
+        <w:pStyle w:val="berschrift2"/>
+        <w:rPr>
+          <w:rFonts w:ascii="Helvetica" w:hAnsi="Helvetica"/>
+          <w:sz w:val="22"/>
+          <w:szCs w:val="22"/>
+        </w:rPr>
+      </w:pPr>
+      <w:r>
+        <w:rPr>
+          <w:rFonts w:ascii="Helvetica" w:hAnsi="Helvetica"/>
+          <w:sz w:val="22"/>
+          <w:szCs w:val="22"/>
+        </w:rPr>
+        <w:t xml:space="preserve">4.4 </w:t>
+      </w:r>
+      <w:r>
+        <w:rPr>
+          <w:rFonts w:ascii="Helvetica" w:hAnsi="Helvetica"/>
+          <w:sz w:val="22"/>
+          <w:szCs w:val="22"/>
+        </w:rPr>
+        <w:t>Konfiguration und Steuerung</w:t>
+      </w:r>
+    </w:p>
+    <w:p>
+      <w:pPr>
         <w:pStyle w:val="StandardWeb"/>
         <w:rPr>
           <w:rFonts w:ascii="Helvetica" w:hAnsi="Helvetica"/>
@@ -5575,6 +5645,253 @@
           <w:szCs w:val="22"/>
         </w:rPr>
       </w:pPr>
+      <w:r>
+        <w:rPr>
+          <w:rFonts w:ascii="Helvetica" w:hAnsi="Helvetica"/>
+          <w:sz w:val="22"/>
+          <w:szCs w:val="22"/>
+        </w:rPr>
+        <w:t>Die Steuerung der Tunnel-Software erfolgt über verschiedene Argumente, die den Betriebsmodus und die Sicherheits</w:t>
+      </w:r>
+      <w:r>
+        <w:rPr>
+          <w:rFonts w:ascii="Helvetica" w:hAnsi="Helvetica"/>
+          <w:sz w:val="22"/>
+          <w:szCs w:val="22"/>
+        </w:rPr>
+        <w:t>maßnahmen</w:t>
+      </w:r>
+      <w:r>
+        <w:rPr>
+          <w:rFonts w:ascii="Helvetica" w:hAnsi="Helvetica"/>
+          <w:sz w:val="22"/>
+          <w:szCs w:val="22"/>
+        </w:rPr>
+        <w:t xml:space="preserve"> definieren:</w:t>
+      </w:r>
+    </w:p>
+    <w:p>
+      <w:pPr>
+        <w:pStyle w:val="StandardWeb"/>
+        <w:rPr>
+          <w:rFonts w:ascii="Helvetica" w:hAnsi="Helvetica"/>
+          <w:sz w:val="22"/>
+          <w:szCs w:val="22"/>
+        </w:rPr>
+      </w:pPr>
+      <w:r>
+        <w:rPr>
+          <w:rFonts w:ascii="Helvetica" w:hAnsi="Helvetica"/>
+          <w:sz w:val="22"/>
+          <w:szCs w:val="22"/>
+        </w:rPr>
+        <w:t>Für den Verbindungsaufbau sind zunächst d</w:t>
+      </w:r>
+      <w:r>
+        <w:rPr>
+          <w:rFonts w:ascii="Helvetica" w:hAnsi="Helvetica"/>
+          <w:sz w:val="22"/>
+          <w:szCs w:val="22"/>
+        </w:rPr>
+        <w:t xml:space="preserve">ie Rolle bzw. der </w:t>
+      </w:r>
+      <w:proofErr w:type="spellStart"/>
+      <w:r>
+        <w:rPr>
+          <w:rFonts w:ascii="Helvetica" w:hAnsi="Helvetica"/>
+          <w:sz w:val="22"/>
+          <w:szCs w:val="22"/>
+        </w:rPr>
+        <w:t>Mode</w:t>
+      </w:r>
+      <w:r>
+        <w:rPr>
+          <w:rFonts w:ascii="Helvetica" w:hAnsi="Helvetica"/>
+          <w:sz w:val="22"/>
+          <w:szCs w:val="22"/>
+        </w:rPr>
+        <w:t xml:space="preserve"> (festgelegt </w:t>
+      </w:r>
+      <w:proofErr w:type="spellEnd"/>
+      <w:r>
+        <w:rPr>
+          <w:rFonts w:ascii="Helvetica" w:hAnsi="Helvetica"/>
+          <w:sz w:val="22"/>
+          <w:szCs w:val="22"/>
+        </w:rPr>
+        <w:t>als Client oder Server) sowie die URI des MQTT-Brokers erforderlich. Jeder Teilnehmer identifiziert sich über eine eindeutige Client-ID</w:t>
+      </w:r>
+      <w:r>
+        <w:rPr>
+          <w:rFonts w:ascii="Helvetica" w:hAnsi="Helvetica"/>
+          <w:sz w:val="22"/>
+          <w:szCs w:val="22"/>
+        </w:rPr>
+        <w:t xml:space="preserve">, die für die Client-Rolle auch als Basis für die individuelle Benennung der Data-Topics dient. Die Bezeichnung des Command-Topics muss zwischen Server und verbindenden Clients übereinstimmen. </w:t>
+      </w:r>
+    </w:p>
+    <w:p>
+      <w:pPr>
+        <w:pStyle w:val="StandardWeb"/>
+        <w:rPr>
+          <w:rFonts w:ascii="Helvetica" w:hAnsi="Helvetica"/>
+          <w:sz w:val="22"/>
+          <w:szCs w:val="22"/>
+        </w:rPr>
+      </w:pPr>
+      <w:r>
+        <w:rPr>
+          <w:rFonts w:ascii="Helvetica" w:hAnsi="Helvetica"/>
+          <w:sz w:val="22"/>
+          <w:szCs w:val="22"/>
+        </w:rPr>
+        <w:t>Im Netzwerkbereich kann zwischen zwei Tunnel-Modi gewählt werden: einer einfachen Punkt-zu-Punkt-Verbindung oder dem Gateway-Modus. Letzterer erfordert auf der Server-Seite die Angabe einer Netzwerkschnittstelle (Interface), um die notwendigen NAT-Regeln für die Traffic-Weiterleitung korrekt anzuwenden.</w:t>
+      </w:r>
+      <w:r>
+        <w:rPr>
+          <w:rFonts w:ascii="Helvetica" w:hAnsi="Helvetica"/>
+          <w:sz w:val="22"/>
+          <w:szCs w:val="22"/>
+        </w:rPr>
+        <w:t xml:space="preserve"> Im Gateway Modus wird die Default-Route des Client-Hosts über den Server gelegt.</w:t>
+      </w:r>
+    </w:p>
+    <w:p>
+      <w:pPr>
+        <w:pStyle w:val="StandardWeb"/>
+        <w:rPr>
+          <w:rFonts w:ascii="Helvetica" w:hAnsi="Helvetica"/>
+          <w:sz w:val="22"/>
+          <w:szCs w:val="22"/>
+        </w:rPr>
+      </w:pPr>
+      <w:r>
+        <w:rPr>
+          <w:rFonts w:ascii="Helvetica" w:hAnsi="Helvetica"/>
+          <w:sz w:val="22"/>
+          <w:szCs w:val="22"/>
+        </w:rPr>
+        <w:t xml:space="preserve">Verschlüsselung </w:t>
+      </w:r>
+      <w:r>
+        <w:rPr>
+          <w:rFonts w:ascii="Helvetica" w:hAnsi="Helvetica"/>
+          <w:sz w:val="22"/>
+          <w:szCs w:val="22"/>
+        </w:rPr>
+        <w:t xml:space="preserve">ist </w:t>
+      </w:r>
+      <w:r>
+        <w:rPr>
+          <w:rFonts w:ascii="Helvetica" w:hAnsi="Helvetica"/>
+          <w:sz w:val="22"/>
+          <w:szCs w:val="22"/>
+        </w:rPr>
+        <w:t xml:space="preserve">standardmäßig aktiv, kann jedoch über das </w:t>
+      </w:r>
+      <w:proofErr w:type="spellStart"/>
+      <w:r>
+        <w:rPr>
+          <w:rFonts w:ascii="Helvetica" w:hAnsi="Helvetica"/>
+          <w:sz w:val="22"/>
+          <w:szCs w:val="22"/>
+        </w:rPr>
+        <w:t>Flag</w:t>
+      </w:r>
+      <w:proofErr w:type="spellEnd"/>
+      <w:r>
+        <w:rPr>
+          <w:rFonts w:ascii="Helvetica" w:hAnsi="Helvetica"/>
+          <w:sz w:val="22"/>
+          <w:szCs w:val="22"/>
+        </w:rPr>
+        <w:t xml:space="preserve"> </w:t>
+      </w:r>
+      <w:r>
+        <w:rPr>
+          <w:rStyle w:val="HTMLCode"/>
+          <w:rFonts w:ascii="Helvetica" w:eastAsiaTheme="majorEastAsia" w:hAnsi="Helvetica"/>
+          <w:sz w:val="22"/>
+          <w:szCs w:val="22"/>
+        </w:rPr>
+        <w:t>--</w:t>
+      </w:r>
+      <w:proofErr w:type="spellStart"/>
+      <w:r>
+        <w:rPr>
+          <w:rStyle w:val="HTMLCode"/>
+          <w:rFonts w:ascii="Helvetica" w:eastAsiaTheme="majorEastAsia" w:hAnsi="Helvetica"/>
+          <w:sz w:val="22"/>
+          <w:szCs w:val="22"/>
+        </w:rPr>
+        <w:t>insecure</w:t>
+      </w:r>
+      <w:proofErr w:type="spellEnd"/>
+      <w:r>
+        <w:rPr>
+          <w:rFonts w:ascii="Helvetica" w:hAnsi="Helvetica"/>
+          <w:sz w:val="22"/>
+          <w:szCs w:val="22"/>
+        </w:rPr>
+        <w:t xml:space="preserve"> deaktiviert werden. Zusätzlich bietet die Option </w:t>
+      </w:r>
+      <w:r>
+        <w:rPr>
+          <w:rStyle w:val="HTMLCode"/>
+          <w:rFonts w:ascii="Helvetica" w:eastAsiaTheme="majorEastAsia" w:hAnsi="Helvetica"/>
+          <w:sz w:val="22"/>
+          <w:szCs w:val="22"/>
+        </w:rPr>
+        <w:t>--</w:t>
+      </w:r>
+      <w:proofErr w:type="spellStart"/>
+      <w:r>
+        <w:rPr>
+          <w:rStyle w:val="HTMLCode"/>
+          <w:rFonts w:ascii="Helvetica" w:eastAsiaTheme="majorEastAsia" w:hAnsi="Helvetica"/>
+          <w:sz w:val="22"/>
+          <w:szCs w:val="22"/>
+        </w:rPr>
+        <w:t>no</w:t>
+      </w:r>
+      <w:proofErr w:type="spellEnd"/>
+      <w:r>
+        <w:rPr>
+          <w:rStyle w:val="HTMLCode"/>
+          <w:rFonts w:ascii="Helvetica" w:eastAsiaTheme="majorEastAsia" w:hAnsi="Helvetica"/>
+          <w:sz w:val="22"/>
+          <w:szCs w:val="22"/>
+        </w:rPr>
+        <w:t>-server-</w:t>
+      </w:r>
+      <w:proofErr w:type="spellStart"/>
+      <w:r>
+        <w:rPr>
+          <w:rStyle w:val="HTMLCode"/>
+          <w:rFonts w:ascii="Helvetica" w:eastAsiaTheme="majorEastAsia" w:hAnsi="Helvetica"/>
+          <w:sz w:val="22"/>
+          <w:szCs w:val="22"/>
+        </w:rPr>
+        <w:t>auth</w:t>
+      </w:r>
+      <w:proofErr w:type="spellEnd"/>
+      <w:r>
+        <w:rPr>
+          <w:rFonts w:ascii="Helvetica" w:hAnsi="Helvetica"/>
+          <w:sz w:val="22"/>
+          <w:szCs w:val="22"/>
+        </w:rPr>
+        <w:t xml:space="preserve"> die Möglichkeit, die Prüfung des Server-Public-Keys zu überspringen, was die Flexibilität in Testumgebungen erhöht. Für </w:t>
+      </w:r>
+      <w:r>
+        <w:rPr>
+          <w:rFonts w:ascii="Helvetica" w:hAnsi="Helvetica"/>
+          <w:sz w:val="22"/>
+          <w:szCs w:val="22"/>
+        </w:rPr>
+        <w:lastRenderedPageBreak/>
+        <w:t>Diagnosezwecke steht ein Verbose-Modus zur Verfügung, der ausführliche Log-Ausgaben für die Fehlersuche generiert.</w:t>
+      </w:r>
     </w:p>
     <w:p>
       <w:pPr>
@@ -5591,7 +5908,6 @@
           <w:sz w:val="22"/>
           <w:szCs w:val="22"/>
         </w:rPr>
-        <w:lastRenderedPageBreak/>
         <w:drawing>
           <wp:inline distT="0" distB="0" distL="0" distR="0" wp14:anchorId="380FECB5" wp14:editId="47FA630D">
             <wp:extent cx="5760720" cy="3244215"/>

</xml_diff>